<commit_message>
15 mai 2026 18h32
</commit_message>
<xml_diff>
--- a/scriptsvideo.docx
+++ b/scriptsvideo.docx
@@ -3,168 +3,423 @@
 <w:document xmlns:wpc="http://schemas.microsoft.com/office/word/2010/wordprocessingCanvas" xmlns:cx="http://schemas.microsoft.com/office/drawing/2014/chartex" xmlns:cx1="http://schemas.microsoft.com/office/drawing/2015/9/8/chartex" xmlns:cx2="http://schemas.microsoft.com/office/drawing/2015/10/21/chartex" xmlns:cx3="http://schemas.microsoft.com/office/drawing/2016/5/9/chartex" xmlns:cx4="http://schemas.microsoft.com/office/drawing/2016/5/10/chartex" xmlns:cx5="http://schemas.microsoft.com/office/drawing/2016/5/11/chartex" xmlns:cx6="http://schemas.microsoft.com/office/drawing/2016/5/12/chartex" xmlns:cx7="http://schemas.microsoft.com/office/drawing/2016/5/13/chartex" xmlns:cx8="http://schemas.microsoft.com/office/drawing/2016/5/14/chartex" xmlns:mc="http://schemas.openxmlformats.org/markup-compatibility/2006" xmlns:aink="http://schemas.microsoft.com/office/drawing/2016/ink" xmlns:am3d="http://schemas.microsoft.com/office/drawing/2017/model3d" xmlns:o="urn:schemas-microsoft-com:office:office" xmlns:r="http://schemas.openxmlformats.org/officeDocument/2006/relationships" xmlns:m="http://schemas.openxmlformats.org/officeDocument/2006/math" xmlns:v="urn:schemas-microsoft-com:vml" xmlns:wp14="http://schemas.microsoft.com/office/word/2010/wordprocessingDrawing" xmlns:wp="http://schemas.openxmlformats.org/drawingml/2006/wordprocessingDrawing" xmlns:w10="urn:schemas-microsoft-com:office:word" xmlns:w="http://schemas.openxmlformats.org/wordprocessingml/2006/main" xmlns:w14="http://schemas.microsoft.com/office/word/2010/wordml" xmlns:w15="http://schemas.microsoft.com/office/word/2012/wordml" xmlns:w16cid="http://schemas.microsoft.com/office/word/2016/wordml/cid" xmlns:w16se="http://schemas.microsoft.com/office/word/2015/wordml/symex" xmlns:wpg="http://schemas.microsoft.com/office/word/2010/wordprocessingGroup" xmlns:wpi="http://schemas.microsoft.com/office/word/2010/wordprocessingInk" xmlns:wne="http://schemas.microsoft.com/office/word/2006/wordml" xmlns:wps="http://schemas.microsoft.com/office/word/2010/wordprocessingShape" mc:Ignorable="w14 w15 w16se w16cid wp14">
   <w:body>
     <w:p>
+      <w:r>
+        <w:t>Job interview</w:t>
+      </w:r>
+    </w:p>
+    <w:p>
+      <w:r>
+        <w:t>Chris : Chris Gardner, How are you ? Good morning. Chris Gardner. Chris Gardner. Good to see you again. Chris Gardner, pleasure. I’ve been sitting out there for the last half hour trying to come up with a story that would explain my being here dressed like this. And i wanted to come up with a story that would demonstrate qualities that i’m sure you all admire here like earnestness or dilligence and team playing, … something. And i couldn’t think of anything. So the truth is, I was arrested for failure to pay parking tickets.</w:t>
+      </w:r>
+    </w:p>
+    <w:p>
+      <w:r>
+        <w:t>Jay : Parking tickets !</w:t>
+      </w:r>
+    </w:p>
+    <w:p>
+      <w:r>
+        <w:t>Chris : And i ran all the way here from the Polk station, the police station.</w:t>
+      </w:r>
+    </w:p>
+    <w:p>
+      <w:r>
+        <w:t>Interviewer : What were your doing before you were arrested ?</w:t>
+      </w:r>
+    </w:p>
+    <w:p>
+      <w:r>
+        <w:t>Chris : I was painting my appartment.</w:t>
+      </w:r>
+    </w:p>
+    <w:p>
+      <w:r>
+        <w:t>Interviewer : Is it dry now ?</w:t>
+      </w:r>
+    </w:p>
+    <w:p>
+      <w:r>
+        <w:t>Chris : I hope so.</w:t>
+      </w:r>
+    </w:p>
+    <w:p>
+      <w:r>
+        <w:t>Interviewer : Jay says you’re pretty determined.</w:t>
+      </w:r>
+    </w:p>
+    <w:p>
+      <w:r>
+        <w:t>Jay : Oh he’s been waiting outside the front of the building with some forty pound guizmo for over a month.</w:t>
+      </w:r>
+    </w:p>
+    <w:p>
+      <w:r>
+        <w:t>Interviewer : He says you’re smart.</w:t>
+      </w:r>
+    </w:p>
+    <w:p>
+      <w:r>
+        <w:t>Chris : I like to think so.</w:t>
+      </w:r>
+    </w:p>
+    <w:p>
+      <w:r>
+        <w:t>Interviewer : And you want to learn this business ?</w:t>
+      </w:r>
+    </w:p>
+    <w:p>
+      <w:r>
+        <w:t>Chris : Yes sir i want to learn this business.</w:t>
+      </w:r>
+    </w:p>
+    <w:p>
+      <w:r>
+        <w:t xml:space="preserve">Interviwer : Have you already started learning on your own ? </w:t>
+      </w:r>
+    </w:p>
+    <w:p>
+      <w:r>
+        <w:t>Chris : Absolutely !</w:t>
+      </w:r>
+    </w:p>
+    <w:p>
+      <w:r>
+        <w:t>Interviwer : How many times have you seen Chris ?</w:t>
+      </w:r>
+    </w:p>
+    <w:p>
+      <w:r>
+        <w:t>Jay : You know, I dont know. One too many apparently.</w:t>
+      </w:r>
+    </w:p>
+    <w:p>
+      <w:r>
+        <w:t>Interviewer : Has he ever dressed like this ?</w:t>
+      </w:r>
+    </w:p>
+    <w:p>
+      <w:r>
+        <w:t>Jay : No, no, Jacket and tie.</w:t>
+      </w:r>
+    </w:p>
+    <w:p>
+      <w:r>
+        <w:t xml:space="preserve">Interviwer : First in your </w:t>
+      </w:r>
+      <w:r>
+        <w:t>class in school</w:t>
+      </w:r>
+      <w:r>
+        <w:t xml:space="preserve">, High school. </w:t>
+      </w:r>
+    </w:p>
+    <w:p>
+      <w:r>
+        <w:t>Chris: Yes, sir.</w:t>
+      </w:r>
+    </w:p>
+    <w:p>
+      <w:r>
+        <w:t xml:space="preserve">Interviewer: </w:t>
+      </w:r>
+      <w:r>
+        <w:t>How many in the class ?</w:t>
+      </w:r>
+    </w:p>
+    <w:p>
+      <w:r>
+        <w:t>Chris : Twelve, it</w:t>
+      </w:r>
+      <w:r>
+        <w:t>’</w:t>
+      </w:r>
+      <w:r>
+        <w:t>s a small town.</w:t>
+      </w:r>
+    </w:p>
+    <w:p>
+      <w:r>
+        <w:t>Interviewer : I’ll say.</w:t>
+      </w:r>
+    </w:p>
+    <w:p>
+      <w:r>
+        <w:t>Chris : But I was also first in my radar class in the NAVY and that was a class of twenty.</w:t>
+      </w:r>
+    </w:p>
+    <w:p>
+      <w:r>
+        <w:lastRenderedPageBreak/>
+        <w:t>Can I say something? I’m the type of person, if you ask me a question and I don’t know the answer, I’m going to tell you that I don’t know. But I’ll bet you what. I know how to find the answer and I will find the answer. Is that fair enough?</w:t>
+      </w:r>
+    </w:p>
+    <w:p>
+      <w:r>
+        <w:t>Interviewer: Chris, what would you say if a guy walk in for interview without a shirt on .. and I hired him, what would you say?</w:t>
+      </w:r>
+    </w:p>
+    <w:p>
+      <w:r>
+        <w:t>Chris: he must’ve had some really nice pants!</w:t>
+      </w:r>
+    </w:p>
+    <w:p/>
+    <w:p>
+      <w:r>
+        <w:br w:type="page"/>
+      </w:r>
+    </w:p>
+    <w:p>
       <w:bookmarkStart w:id="0" w:name="_GoBack"/>
       <w:r>
-        <w:t>Chris : Chris Gardner, How are you ? Good morning. Chris Gardner. Chris Gardner. Good to see you again. Chris Gardner, pleasure. I’ve been sitting out there for the last half hour trying to come up with a story that would explain my being here dressed like this. And i wanted to come up with a story that would demonstrate qualities that i’m sure you all admire here like earnestness or dilligence and team playing, … something. And i couldn’t think of anything. So the truth is, I was arrested for failure to pay parking tickets.</w:t>
-      </w:r>
-    </w:p>
-    <w:p>
-      <w:r>
-        <w:t>Jay : Parking tickets !</w:t>
-      </w:r>
-    </w:p>
-    <w:p>
-      <w:r>
-        <w:t>Chris : And i ran all the way here from the Polk station, the police station.</w:t>
-      </w:r>
-    </w:p>
-    <w:p>
-      <w:r>
-        <w:t>Interviewer : What were your doing before you were arrested ?</w:t>
-      </w:r>
-    </w:p>
-    <w:p>
-      <w:r>
-        <w:t>Chris : I was painting my appartment.</w:t>
-      </w:r>
-    </w:p>
-    <w:p>
-      <w:r>
-        <w:t>Interviewer : Is it dry now ?</w:t>
-      </w:r>
-    </w:p>
-    <w:p>
-      <w:r>
-        <w:t>Chris : I hope so.</w:t>
-      </w:r>
-    </w:p>
-    <w:p>
-      <w:r>
-        <w:t>Interviewer : Jay says you’re pretty determined.</w:t>
-      </w:r>
-    </w:p>
-    <w:p>
-      <w:r>
-        <w:t>Jay : Oh he’s been waiting outside the front of the building with some forty pound guizmo for over a month.</w:t>
-      </w:r>
-    </w:p>
-    <w:p>
-      <w:r>
-        <w:t>Interviewer : He says you’re smart.</w:t>
-      </w:r>
-    </w:p>
-    <w:p>
-      <w:r>
-        <w:t>Chris : I like to think so.</w:t>
-      </w:r>
-    </w:p>
-    <w:p>
-      <w:r>
-        <w:t>Interviewer : And you want to learn this business ?</w:t>
-      </w:r>
-    </w:p>
-    <w:p>
-      <w:r>
-        <w:t>Chris : Yes sir i want to learn this business.</w:t>
-      </w:r>
-    </w:p>
-    <w:p>
-      <w:r>
-        <w:t xml:space="preserve">Interviwer : Have you already started learning on your own ? </w:t>
-      </w:r>
-    </w:p>
-    <w:p>
-      <w:r>
-        <w:t>Chris : Absolutely !</w:t>
-      </w:r>
-    </w:p>
-    <w:p>
-      <w:r>
-        <w:t>Interviwer : How many times have you seen Chris ?</w:t>
-      </w:r>
-    </w:p>
-    <w:p>
-      <w:r>
-        <w:t>Jay : You know, I dont know. One too many apparently.</w:t>
-      </w:r>
-    </w:p>
-    <w:p>
-      <w:r>
-        <w:t>Interviewer : Has he ever dressed like this ?</w:t>
-      </w:r>
-    </w:p>
-    <w:p>
-      <w:r>
-        <w:t>Jay : No, no, Jacket and tie.</w:t>
-      </w:r>
-    </w:p>
-    <w:p>
-      <w:r>
-        <w:t xml:space="preserve">Interviwer : First in your </w:t>
-      </w:r>
-      <w:r>
-        <w:t>class in school</w:t>
-      </w:r>
-      <w:r>
-        <w:t xml:space="preserve">, High school. </w:t>
-      </w:r>
-    </w:p>
-    <w:p>
-      <w:r>
-        <w:t>Chris: Yes, sir.</w:t>
-      </w:r>
-    </w:p>
-    <w:p>
-      <w:r>
-        <w:t xml:space="preserve">Interviewer: </w:t>
-      </w:r>
-      <w:r>
-        <w:t>How many in the class ?</w:t>
-      </w:r>
-    </w:p>
-    <w:p>
-      <w:r>
-        <w:t>Chris : Twelve, it</w:t>
-      </w:r>
-      <w:r>
-        <w:t>’</w:t>
-      </w:r>
-      <w:r>
-        <w:t>s a small town.</w:t>
-      </w:r>
-    </w:p>
-    <w:p>
-      <w:r>
-        <w:t>Interviewer : I’ll say.</w:t>
-      </w:r>
-    </w:p>
-    <w:p>
-      <w:r>
-        <w:t>Chris : But I was also first in my radar class in the NAVY and that was a class of twenty.</w:t>
-      </w:r>
-    </w:p>
-    <w:p>
-      <w:r>
-        <w:t>Can I say something? I’m the type of person, if you ask me a question and I don’t know the answer, I’m going to tell you that I don’t know. But I’ll bet you what. I know how to find the answer and I will find the answer. Is that fair enough?</w:t>
-      </w:r>
-    </w:p>
-    <w:p>
-      <w:r>
         <w:lastRenderedPageBreak/>
-        <w:t>Interviewer: Chris, what would you say if a guy walk in for interview without a shirt on .. and I hired him, what would you say?</w:t>
-      </w:r>
-    </w:p>
-    <w:p>
-      <w:r>
-        <w:t>Chris: he must’ve had some really nice pants!</w:t>
-      </w:r>
-    </w:p>
+        <w:t>Friends the bad birthday gift</w:t>
+      </w:r>
+    </w:p>
+    <w:p>
+      <w:r>
+        <w:t>Rachel: you know what we should all do ? go see a musical</w:t>
+      </w:r>
+    </w:p>
+    <w:p>
+      <w:r>
+        <w:t xml:space="preserve">Chandler: </w:t>
+      </w:r>
+      <w:r>
+        <w:t>Sure</w:t>
+      </w:r>
+    </w:p>
+    <w:p>
+      <w:r>
+        <w:t xml:space="preserve">Rachel: </w:t>
+      </w:r>
+      <w:r>
+        <w:t xml:space="preserve">And you know which one we should see? The 1996 Tony Award winner. Do you happen to know the name of that one? </w:t>
+      </w:r>
+    </w:p>
+    <w:p>
+      <w:r>
+        <w:t xml:space="preserve">Chandler: </w:t>
+      </w:r>
+      <w:r>
+        <w:t xml:space="preserve">I don’t know, um, “Grease”? </w:t>
+      </w:r>
+    </w:p>
+    <w:p>
+      <w:r>
+        <w:t xml:space="preserve">Rachel: </w:t>
+      </w:r>
+      <w:r>
+        <w:t xml:space="preserve">No </w:t>
+      </w:r>
+    </w:p>
+    <w:p>
+      <w:r>
+        <w:t xml:space="preserve">Chandler: </w:t>
+      </w:r>
+      <w:r>
+        <w:t>“Rent”</w:t>
+      </w:r>
+    </w:p>
+    <w:p>
+      <w:r>
+        <w:t xml:space="preserve">Rachel: </w:t>
+      </w:r>
+      <w:r>
+        <w:t xml:space="preserve">Yes, Rent! </w:t>
+      </w:r>
+    </w:p>
+    <w:p>
+      <w:r>
+        <w:t xml:space="preserve">Chandler: </w:t>
+      </w:r>
+      <w:r>
+        <w:t>Okay, so when do you want to go ?</w:t>
+      </w:r>
+    </w:p>
+    <w:p>
+      <w:r>
+        <w:t xml:space="preserve">Rachel: </w:t>
+      </w:r>
+      <w:r>
+        <w:t>What, Oh I’m sorry. I can’t I’m busy.</w:t>
+      </w:r>
+    </w:p>
+    <w:p>
+      <w:r>
+        <w:t xml:space="preserve">Joey: </w:t>
+      </w:r>
+      <w:r>
+        <w:t xml:space="preserve">Hey </w:t>
+      </w:r>
+    </w:p>
+    <w:p>
+      <w:r>
+        <w:t xml:space="preserve">Chandler: </w:t>
+      </w:r>
+      <w:r>
+        <w:t>Hey</w:t>
+      </w:r>
+    </w:p>
+    <w:p>
+      <w:r>
+        <w:t xml:space="preserve">Joey: </w:t>
+      </w:r>
+      <w:r>
+        <w:t>Man it is so hard to shop for girls</w:t>
+      </w:r>
+    </w:p>
+    <w:p>
+      <w:r>
+        <w:t xml:space="preserve">Chandler: </w:t>
+      </w:r>
+      <w:r>
+        <w:t>Yes it is at office max</w:t>
+      </w:r>
+    </w:p>
+    <w:p>
+      <w:r>
+        <w:t xml:space="preserve">Rachel: </w:t>
+      </w:r>
+      <w:r>
+        <w:t>What did you get her?</w:t>
+      </w:r>
+    </w:p>
+    <w:p>
+      <w:r>
+        <w:t xml:space="preserve">Chandler: </w:t>
+      </w:r>
+      <w:r>
+        <w:t>A pen</w:t>
+      </w:r>
+    </w:p>
+    <w:p>
+      <w:r>
+        <w:t xml:space="preserve">Joey: </w:t>
+      </w:r>
+      <w:r>
+        <w:t>It’s two gifts</w:t>
+      </w:r>
+      <w:r>
+        <w:t xml:space="preserve"> </w:t>
+      </w:r>
+      <w:r>
+        <w:t>in one it’s a pen, that’s also a clock huh?</w:t>
+      </w:r>
+    </w:p>
+    <w:p>
+      <w:r>
+        <w:t xml:space="preserve">Chandler: </w:t>
+      </w:r>
+      <w:r>
+        <w:t xml:space="preserve">You can’t give her that! </w:t>
+      </w:r>
+    </w:p>
+    <w:p>
+      <w:r>
+        <w:t xml:space="preserve">Joey: </w:t>
+      </w:r>
+      <w:r>
+        <w:t>Why not?</w:t>
+      </w:r>
+    </w:p>
+    <w:p>
+      <w:r>
+        <w:t xml:space="preserve">Chandler: </w:t>
+      </w:r>
+      <w:r>
+        <w:t xml:space="preserve">Because she’s not eleven! And it’s not the seventh night of hannukah! </w:t>
+      </w:r>
+    </w:p>
+    <w:p>
+      <w:r>
+        <w:t xml:space="preserve">Rachel: </w:t>
+      </w:r>
+      <w:r>
+        <w:t>Okay, honey, what he means by that is, while this is a very nice gift, maybe it’s just note something a boyfriend gives?</w:t>
+      </w:r>
+    </w:p>
+    <w:p>
+      <w:r>
+        <w:t xml:space="preserve">Joey: </w:t>
+      </w:r>
+      <w:r>
+        <w:t>Sure it is! she needs a pen for work, she’s writing, she turns it ouver wow! It’s time for my date with joey!</w:t>
+      </w:r>
+    </w:p>
+    <w:p>
+      <w:r>
+        <w:t xml:space="preserve">Chandler: </w:t>
+      </w:r>
+      <w:r>
+        <w:t>Alright look look, what … what did you get for angela dovakiel for her birthday?</w:t>
+      </w:r>
+    </w:p>
+    <w:p>
+      <w:r>
+        <w:t xml:space="preserve">Joey: </w:t>
+      </w:r>
+      <w:r>
+        <w:t>She didn’t have a birthday while we were going out</w:t>
+      </w:r>
+    </w:p>
+    <w:p>
+      <w:r>
+        <w:t xml:space="preserve">Chandler: </w:t>
+      </w:r>
+      <w:r>
+        <w:t>For three years !</w:t>
+      </w:r>
+    </w:p>
+    <w:p>
+      <w:r>
+        <w:t xml:space="preserve">Joey: </w:t>
+      </w:r>
+      <w:r>
+        <w:t>Look, it’s too late, and I got an audition. I Can’t shop anymore, I…</w:t>
+      </w:r>
+    </w:p>
+    <w:p>
+      <w:r>
+        <w:t xml:space="preserve">Chandler: </w:t>
+      </w:r>
+      <w:r>
+        <w:t>Alright, I will go out and I will try to find something for her okay ?</w:t>
+      </w:r>
+    </w:p>
+    <w:p>
+      <w:r>
+        <w:t xml:space="preserve">Joey: </w:t>
+      </w:r>
+      <w:r>
+        <w:t>Thanks man, and oh while you’re at it could you get her a card ?</w:t>
+      </w:r>
+    </w:p>
+    <w:p>
+      <w:r>
+        <w:t xml:space="preserve">Chandler: </w:t>
+      </w:r>
+      <w:r>
+        <w:t>Would you write me to write her a little poem as well?</w:t>
+      </w:r>
+    </w:p>
+    <w:p>
+      <w:r>
+        <w:lastRenderedPageBreak/>
+        <w:t xml:space="preserve">Joey: </w:t>
+      </w:r>
+      <w:r>
+        <w:t>Or just get a card that has a poem already in it</w:t>
+      </w:r>
+    </w:p>
+    <w:bookmarkEnd w:id="0"/>
     <w:p/>
     <w:p/>
     <w:p/>
     <w:p/>
     <w:p/>
-    <w:bookmarkEnd w:id="0"/>
+    <w:p/>
+    <w:p/>
     <w:p/>
     <w:sectPr>
       <w:pgSz w:w="11906" w:h="16838"/>

</xml_diff>